<commit_message>
Update Technical Report Zoey McCall.docx
</commit_message>
<xml_diff>
--- a/Technical Report Zoey McCall.docx
+++ b/Technical Report Zoey McCall.docx
@@ -867,23 +867,7 @@
           <w:sz w:val="18"/>
           <w:szCs w:val="18"/>
         </w:rPr>
-        <w:t>: Converts particle simulation into VDB volumes, tapers volumes based on user-input (</w:t>
-      </w:r>
-      <w:proofErr w:type="spellStart"/>
-      <w:r>
-        <w:rPr>
-          <w:sz w:val="18"/>
-          <w:szCs w:val="18"/>
-        </w:rPr>
-        <w:t>pscale</w:t>
-      </w:r>
-      <w:proofErr w:type="spellEnd"/>
-      <w:r>
-        <w:rPr>
-          <w:sz w:val="18"/>
-          <w:szCs w:val="18"/>
-        </w:rPr>
-        <w:t>), and procedurally generates UVs per-frame for texturing in-engine.</w:t>
+        <w:t>: Converts particle simulation into VDB volumes, tapers volumes based on user-input (pscale), and procedurally generates UVs per-frame for texturing in-engine.</w:t>
       </w:r>
     </w:p>
     <w:p>
@@ -950,23 +934,7 @@
           <w:sz w:val="18"/>
           <w:szCs w:val="18"/>
         </w:rPr>
-        <w:t xml:space="preserve">One key constraint during development was usability for animated growth. As Unreal can’t natively import all frames of the live simulation efficiently, the tool provides a variable to freeze time (using </w:t>
-      </w:r>
-      <w:proofErr w:type="spellStart"/>
-      <w:r>
-        <w:rPr>
-          <w:sz w:val="18"/>
-          <w:szCs w:val="18"/>
-        </w:rPr>
-        <w:t>TimeShift</w:t>
-      </w:r>
-      <w:proofErr w:type="spellEnd"/>
-      <w:r>
-        <w:rPr>
-          <w:sz w:val="18"/>
-          <w:szCs w:val="18"/>
-        </w:rPr>
-        <w:t xml:space="preserve"> node). This gives the Engine user a static fungus mesh that can apply over their </w:t>
+        <w:t xml:space="preserve">One key constraint during development was usability for animated growth. As Unreal can’t natively import all frames of the live simulation efficiently, the tool provides a variable to freeze time (using TimeShift node). This gives the Engine user a static fungus mesh that can apply over their </w:t>
       </w:r>
       <w:r>
         <w:rPr>
@@ -1338,7 +1306,7 @@
           <w:szCs w:val="21"/>
         </w:rPr>
         <w:drawing>
-          <wp:anchor distT="0" distB="0" distL="114300" distR="114300" simplePos="0" relativeHeight="251659264" behindDoc="1" locked="0" layoutInCell="1" allowOverlap="1" wp14:anchorId="53F6218A" wp14:editId="77568CEB">
+          <wp:anchor distT="0" distB="0" distL="114300" distR="114300" simplePos="0" relativeHeight="251659264" behindDoc="1" locked="0" layoutInCell="1" allowOverlap="1" wp14:anchorId="53F6218A" wp14:editId="6C8F86E7">
             <wp:simplePos x="0" y="0"/>
             <wp:positionH relativeFrom="margin">
               <wp:align>right</wp:align>
@@ -2792,44 +2760,11 @@
           <w:szCs w:val="21"/>
         </w:rPr>
       </w:pPr>
-      <w:r>
-        <w:rPr>
-          <w:szCs w:val="21"/>
-        </w:rPr>
-        <w:t xml:space="preserve">Nikita Kuvaev (2023) </w:t>
-      </w:r>
-      <w:r>
-        <w:rPr>
-          <w:szCs w:val="21"/>
-        </w:rPr>
-        <w:t>How to make The Last Of Us fungus (cordyceps) from intro in Houdini</w:t>
-      </w:r>
-      <w:r>
-        <w:rPr>
-          <w:szCs w:val="21"/>
-        </w:rPr>
-        <w:t xml:space="preserve"> Available at: </w:t>
-      </w:r>
-      <w:hyperlink r:id="rId10" w:history="1">
-        <w:r>
-          <w:rPr>
-            <w:rStyle w:val="Hyperlink"/>
-            <w:szCs w:val="21"/>
-          </w:rPr>
-          <w:t>https://www.youtube.com/watch?v=73hNQyvqc4c</w:t>
-        </w:r>
-      </w:hyperlink>
-      <w:r>
-        <w:rPr>
-          <w:szCs w:val="21"/>
-        </w:rPr>
-        <w:t xml:space="preserve"> </w:t>
-      </w:r>
     </w:p>
     <w:sectPr>
-      <w:headerReference w:type="default" r:id="rId11"/>
-      <w:footerReference w:type="even" r:id="rId12"/>
-      <w:footerReference w:type="default" r:id="rId13"/>
+      <w:headerReference w:type="default" r:id="rId10"/>
+      <w:footerReference w:type="even" r:id="rId11"/>
+      <w:footerReference w:type="default" r:id="rId12"/>
       <w:pgSz w:w="11906" w:h="16838"/>
       <w:pgMar w:top="1440" w:right="1440" w:bottom="1440" w:left="1440" w:header="708" w:footer="708" w:gutter="0"/>
       <w:cols w:space="708"/>
@@ -8951,6 +8886,7 @@
   <w:style w:type="character" w:default="1" w:styleId="DefaultParagraphFont">
     <w:name w:val="Default Paragraph Font"/>
     <w:uiPriority w:val="1"/>
+    <w:semiHidden/>
     <w:unhideWhenUsed/>
   </w:style>
   <w:style w:type="table" w:default="1" w:styleId="TableNormal">

</xml_diff>